<commit_message>
feat(academic): implement student mail watcher and complete STEP Java curriculum weeks 1 to 6
</commit_message>
<xml_diff>
--- a/outputs/academic_solved/docx/GCR-OS-301.docx
+++ b/outputs/academic_solved/docx/GCR-OS-301.docx
@@ -193,6 +193,14 @@
         <w:t>### Solution: Banker's Algorithm Implementation</w:t>
         <w:br/>
         <w:t>Safe Sequence verified: `P1 -&gt; P3 -&gt; P4 -&gt; P0 -&gt; P2`. Full C implementation compiled.</w:t>
+        <w:br/>
+        <w:br/>
+        <w:t>---</w:t>
+        <w:br/>
+        <w:t>Submitted by: RAM CHARAN VANGA (RA2511027010164)</w:t>
+        <w:br/>
+        <w:t>Department of Computer Science &amp; Engineering (Big Data Analytics)</w:t>
+        <w:br/>
       </w:r>
     </w:p>
     <w:p>

</xml_diff>